<commit_message>
Modificación en el contenido de la landing page actualizado.
</commit_message>
<xml_diff>
--- a/assets/CVs/ENGLISH/PROJECT MANAGER/Yerman_Merel_CV2025.docx
+++ b/assets/CVs/ENGLISH/PROJECT MANAGER/Yerman_Merel_CV2025.docx
@@ -13,7 +13,6 @@
           <w:szCs w:val="32"/>
         </w:rPr>
       </w:pPr>
-      <w:proofErr w:type="spellStart"/>
       <w:r>
         <w:rPr>
           <w:rFonts w:ascii="Arial" w:hAnsi="Arial" w:cs="Arial"/>
@@ -22,18 +21,7 @@
           <w:sz w:val="32"/>
           <w:szCs w:val="32"/>
         </w:rPr>
-        <w:t>Yerman</w:t>
-      </w:r>
-      <w:proofErr w:type="spellEnd"/>
-      <w:r>
-        <w:rPr>
-          <w:rFonts w:ascii="Arial" w:hAnsi="Arial" w:cs="Arial"/>
-          <w:b/>
-          <w:bCs/>
-          <w:sz w:val="32"/>
-          <w:szCs w:val="32"/>
-        </w:rPr>
-        <w:t xml:space="preserve"> J. Merel G.</w:t>
+        <w:t>Yerman J. Merel G.</w:t>
       </w:r>
     </w:p>
     <w:p>
@@ -41,6 +29,8 @@
         <w:jc w:val="center"/>
         <w:rPr>
           <w:rFonts w:ascii="Arial" w:hAnsi="Arial" w:cs="Arial"/>
+          <w:sz w:val="20"/>
+          <w:szCs w:val="20"/>
         </w:rPr>
       </w:pPr>
       <w:r>
@@ -137,14 +127,6 @@
           <w:sz w:val="20"/>
           <w:szCs w:val="20"/>
         </w:rPr>
-        <w:t xml:space="preserve"> / (+49) 175 1408223</w:t>
-      </w:r>
-      <w:r>
-        <w:rPr>
-          <w:rFonts w:ascii="Arial" w:hAnsi="Arial" w:cs="Arial"/>
-          <w:sz w:val="20"/>
-          <w:szCs w:val="20"/>
-        </w:rPr>
         <w:t xml:space="preserve"> </w:t>
       </w:r>
       <w:r>
@@ -162,138 +144,75 @@
           <w:szCs w:val="20"/>
         </w:rPr>
         <w:t xml:space="preserve"> </w:t>
-      </w:r>
-      <w:r>
-        <w:fldChar w:fldCharType="begin"/>
-      </w:r>
-      <w:r>
-        <w:instrText>HYPERLINK "mailto:ymerel_02@outlook.com"</w:instrText>
-      </w:r>
-      <w:r>
-        <w:fldChar w:fldCharType="separate"/>
-      </w:r>
-      <w:r>
-        <w:rPr>
-          <w:rStyle w:val="Hyperlink"/>
-          <w:rFonts w:ascii="Arial" w:hAnsi="Arial" w:cs="Arial"/>
-          <w:sz w:val="20"/>
-          <w:szCs w:val="20"/>
-        </w:rPr>
-        <w:t>ymerel_02@outlook.com</w:t>
-      </w:r>
-      <w:r>
-        <w:fldChar w:fldCharType="end"/>
-      </w:r>
-      <w:r>
-        <w:rPr>
-          <w:rFonts w:ascii="Arial" w:hAnsi="Arial" w:cs="Arial"/>
-          <w:sz w:val="20"/>
-          <w:szCs w:val="20"/>
-        </w:rPr>
-        <w:t xml:space="preserve"> </w:t>
-      </w:r>
-      <w:r>
-        <w:rPr>
-          <w:rFonts w:ascii="Arial" w:hAnsi="Arial" w:cs="Arial"/>
-          <w:sz w:val="20"/>
-          <w:szCs w:val="20"/>
-        </w:rPr>
-        <w:t>|</w:t>
-      </w:r>
-      <w:r>
-        <w:rPr>
-          <w:rFonts w:ascii="Arial" w:hAnsi="Arial" w:cs="Arial"/>
-          <w:sz w:val="20"/>
-          <w:szCs w:val="20"/>
-        </w:rPr>
-        <w:t xml:space="preserve"> </w:t>
-      </w:r>
-      <w:r>
-        <w:rPr>
-          <w:rFonts w:ascii="Arial" w:hAnsi="Arial" w:cs="Arial"/>
-          <w:sz w:val="20"/>
-          <w:szCs w:val="20"/>
-          <w:lang w:val="es-ES"/>
-        </w:rPr>
-        <w:fldChar w:fldCharType="begin"/>
-      </w:r>
-      <w:r>
-        <w:rPr>
-          <w:rFonts w:ascii="Arial" w:hAnsi="Arial" w:cs="Arial"/>
-          <w:sz w:val="20"/>
-          <w:szCs w:val="20"/>
-        </w:rPr>
-        <w:instrText>HYPERLINK "https://engyermanmerel.github.io/"</w:instrText>
-      </w:r>
-      <w:r>
-        <w:rPr>
-          <w:rFonts w:ascii="Arial" w:hAnsi="Arial" w:cs="Arial"/>
-          <w:sz w:val="20"/>
-          <w:szCs w:val="20"/>
-          <w:lang w:val="es-ES"/>
-        </w:rPr>
-      </w:r>
-      <w:r>
-        <w:rPr>
-          <w:rFonts w:ascii="Arial" w:hAnsi="Arial" w:cs="Arial"/>
-          <w:sz w:val="20"/>
-          <w:szCs w:val="20"/>
-          <w:lang w:val="es-ES"/>
-        </w:rPr>
-        <w:fldChar w:fldCharType="separate"/>
-      </w:r>
-      <w:r>
-        <w:rPr>
-          <w:rStyle w:val="Hyperlink"/>
-          <w:rFonts w:ascii="Arial" w:hAnsi="Arial" w:cs="Arial"/>
-          <w:sz w:val="20"/>
-          <w:szCs w:val="20"/>
-        </w:rPr>
-        <w:t>Portfo</w:t>
-      </w:r>
-      <w:r>
-        <w:rPr>
-          <w:rStyle w:val="Hyperlink"/>
-          <w:rFonts w:ascii="Arial" w:hAnsi="Arial" w:cs="Arial"/>
-          <w:sz w:val="20"/>
-          <w:szCs w:val="20"/>
-        </w:rPr>
-        <w:t>l</w:t>
-      </w:r>
-      <w:r>
-        <w:rPr>
-          <w:rStyle w:val="Hyperlink"/>
-          <w:rFonts w:ascii="Arial" w:hAnsi="Arial" w:cs="Arial"/>
-          <w:sz w:val="20"/>
-          <w:szCs w:val="20"/>
-        </w:rPr>
-        <w:t>io</w:t>
-      </w:r>
-      <w:r>
-        <w:rPr>
-          <w:rFonts w:ascii="Arial" w:hAnsi="Arial" w:cs="Arial"/>
-          <w:sz w:val="20"/>
-          <w:szCs w:val="20"/>
-          <w:lang w:val="es-ES"/>
-        </w:rPr>
-        <w:fldChar w:fldCharType="end"/>
-      </w:r>
-      <w:r>
-        <w:t xml:space="preserve"> </w:t>
-      </w:r>
-      <w:r>
-        <w:rPr>
-          <w:rFonts w:ascii="Arial" w:hAnsi="Arial" w:cs="Arial"/>
-          <w:sz w:val="20"/>
-          <w:szCs w:val="20"/>
-        </w:rPr>
-        <w:t xml:space="preserve">| </w:t>
       </w:r>
       <w:hyperlink r:id="rId5" w:history="1">
         <w:r>
           <w:rPr>
             <w:rStyle w:val="Hyperlink"/>
             <w:rFonts w:ascii="Arial" w:hAnsi="Arial" w:cs="Arial"/>
+            <w:sz w:val="20"/>
+            <w:szCs w:val="20"/>
+          </w:rPr>
+          <w:t>ymerel_02@outlook.com</w:t>
+        </w:r>
+      </w:hyperlink>
+      <w:r>
+        <w:rPr>
+          <w:rFonts w:ascii="Arial" w:hAnsi="Arial" w:cs="Arial"/>
+          <w:sz w:val="20"/>
+          <w:szCs w:val="20"/>
+        </w:rPr>
+        <w:t xml:space="preserve"> </w:t>
+      </w:r>
+      <w:r>
+        <w:rPr>
+          <w:rFonts w:ascii="Arial" w:hAnsi="Arial" w:cs="Arial"/>
+          <w:sz w:val="20"/>
+          <w:szCs w:val="20"/>
+        </w:rPr>
+        <w:t>|</w:t>
+      </w:r>
+      <w:r>
+        <w:rPr>
+          <w:rFonts w:ascii="Arial" w:hAnsi="Arial" w:cs="Arial"/>
+          <w:sz w:val="20"/>
+          <w:szCs w:val="20"/>
+        </w:rPr>
+        <w:t xml:space="preserve"> </w:t>
+      </w:r>
+      <w:hyperlink r:id="rId6" w:history="1">
+        <w:r>
+          <w:rPr>
+            <w:rStyle w:val="Hyperlink"/>
+            <w:rFonts w:ascii="Arial" w:hAnsi="Arial" w:cs="Arial"/>
+            <w:sz w:val="20"/>
+            <w:szCs w:val="20"/>
+          </w:rPr>
+          <w:t>Portfolio</w:t>
+        </w:r>
+      </w:hyperlink>
+      <w:r>
+        <w:rPr>
+          <w:sz w:val="20"/>
+          <w:szCs w:val="20"/>
+        </w:rPr>
+        <w:t xml:space="preserve"> </w:t>
+      </w:r>
+      <w:r>
+        <w:rPr>
+          <w:rFonts w:ascii="Arial" w:hAnsi="Arial" w:cs="Arial"/>
+          <w:sz w:val="20"/>
+          <w:szCs w:val="20"/>
+        </w:rPr>
+        <w:t xml:space="preserve">| </w:t>
+      </w:r>
+      <w:hyperlink r:id="rId7" w:history="1">
+        <w:r>
+          <w:rPr>
+            <w:rStyle w:val="Hyperlink"/>
+            <w:rFonts w:ascii="Arial" w:hAnsi="Arial" w:cs="Arial"/>
+            <w:sz w:val="20"/>
+            <w:szCs w:val="20"/>
           </w:rPr>
           <w:t>LinkedIn</w:t>
         </w:r>
@@ -330,7 +249,7 @@
           <w:sz w:val="20"/>
           <w:szCs w:val="24"/>
         </w:rPr>
-        <w:t>Mechanical Engineer with international experience in large-scale tunneling and infrastructure projects across Panama, Peru, and Germany. Skilled in bridging design and execution phases, with hands-on expertise in static analysis, FAT procedures, and equipment installation. Recognized for delivering efficient, field-proven engineering solutions that enhance reliability, safety, and performance</w:t>
+        <w:t>Mechanical Engineer with a focus on Systems Engineering (MBSE). Specialist in transforming technical operations into profitable workflows through computational modeling and cost analysis. Experienced in international underground infrastructure projects and designing operational architectures for R&amp;D startups</w:t>
       </w:r>
       <w:r>
         <w:rPr>
@@ -635,18 +554,160 @@
           <w:szCs w:val="20"/>
         </w:rPr>
       </w:pPr>
-      <w:proofErr w:type="spellStart"/>
-      <w:r>
-        <w:rPr>
-          <w:rFonts w:ascii="Arial" w:eastAsia="Arial" w:hAnsi="Arial"/>
-          <w:b/>
-          <w:bCs/>
-          <w:sz w:val="20"/>
-          <w:szCs w:val="20"/>
-        </w:rPr>
-        <w:t>Herrenknecht</w:t>
-      </w:r>
-      <w:proofErr w:type="spellEnd"/>
+      <w:r>
+        <w:rPr>
+          <w:rFonts w:ascii="Arial" w:eastAsia="Arial" w:hAnsi="Arial"/>
+          <w:b/>
+          <w:bCs/>
+          <w:sz w:val="20"/>
+          <w:szCs w:val="20"/>
+        </w:rPr>
+        <w:t>MONCAN</w:t>
+      </w:r>
+      <w:r>
+        <w:rPr>
+          <w:rFonts w:ascii="Arial" w:eastAsia="Arial" w:hAnsi="Arial"/>
+          <w:b/>
+          <w:bCs/>
+          <w:sz w:val="20"/>
+          <w:szCs w:val="20"/>
+        </w:rPr>
+        <w:t xml:space="preserve">    </w:t>
+      </w:r>
+      <w:r>
+        <w:rPr>
+          <w:rFonts w:ascii="Arial" w:eastAsia="Arial" w:hAnsi="Arial"/>
+          <w:b/>
+          <w:bCs/>
+          <w:sz w:val="20"/>
+          <w:szCs w:val="20"/>
+        </w:rPr>
+        <w:tab/>
+      </w:r>
+      <w:r>
+        <w:rPr>
+          <w:rFonts w:ascii="Arial" w:eastAsia="Arial" w:hAnsi="Arial"/>
+          <w:b/>
+          <w:bCs/>
+          <w:sz w:val="20"/>
+          <w:szCs w:val="20"/>
+        </w:rPr>
+        <w:tab/>
+      </w:r>
+      <w:r>
+        <w:rPr>
+          <w:rFonts w:ascii="Arial" w:eastAsia="Arial" w:hAnsi="Arial"/>
+          <w:b/>
+          <w:bCs/>
+          <w:sz w:val="20"/>
+          <w:szCs w:val="20"/>
+        </w:rPr>
+        <w:tab/>
+      </w:r>
+      <w:r>
+        <w:rPr>
+          <w:rFonts w:ascii="Arial" w:eastAsia="Arial" w:hAnsi="Arial"/>
+          <w:b/>
+          <w:bCs/>
+          <w:sz w:val="20"/>
+          <w:szCs w:val="20"/>
+        </w:rPr>
+        <w:tab/>
+      </w:r>
+      <w:r>
+        <w:rPr>
+          <w:rFonts w:ascii="Arial" w:eastAsia="Arial" w:hAnsi="Arial"/>
+          <w:b/>
+          <w:bCs/>
+          <w:sz w:val="20"/>
+          <w:szCs w:val="20"/>
+        </w:rPr>
+        <w:tab/>
+      </w:r>
+      <w:r>
+        <w:rPr>
+          <w:rFonts w:ascii="Arial" w:eastAsia="Arial" w:hAnsi="Arial"/>
+          <w:b/>
+          <w:bCs/>
+          <w:sz w:val="20"/>
+          <w:szCs w:val="20"/>
+        </w:rPr>
+        <w:tab/>
+      </w:r>
+      <w:r>
+        <w:rPr>
+          <w:rFonts w:ascii="Arial" w:eastAsia="Arial" w:hAnsi="Arial"/>
+          <w:b/>
+          <w:bCs/>
+          <w:sz w:val="20"/>
+          <w:szCs w:val="20"/>
+        </w:rPr>
+        <w:tab/>
+      </w:r>
+      <w:r>
+        <w:rPr>
+          <w:rFonts w:ascii="Arial" w:eastAsia="Arial" w:hAnsi="Arial"/>
+          <w:b/>
+          <w:bCs/>
+          <w:sz w:val="20"/>
+          <w:szCs w:val="20"/>
+        </w:rPr>
+        <w:tab/>
+      </w:r>
+      <w:r>
+        <w:rPr>
+          <w:rFonts w:ascii="Arial" w:eastAsia="Arial" w:hAnsi="Arial"/>
+          <w:b/>
+          <w:bCs/>
+          <w:sz w:val="20"/>
+          <w:szCs w:val="20"/>
+        </w:rPr>
+        <w:tab/>
+      </w:r>
+      <w:r>
+        <w:rPr>
+          <w:rFonts w:ascii="Arial" w:eastAsia="Arial" w:hAnsi="Arial"/>
+          <w:b/>
+          <w:bCs/>
+          <w:sz w:val="20"/>
+          <w:szCs w:val="20"/>
+        </w:rPr>
+        <w:tab/>
+      </w:r>
+      <w:r>
+        <w:rPr>
+          <w:rFonts w:ascii="Arial" w:eastAsia="Arial" w:hAnsi="Arial"/>
+          <w:b/>
+          <w:bCs/>
+          <w:sz w:val="20"/>
+          <w:szCs w:val="20"/>
+        </w:rPr>
+        <w:t xml:space="preserve">            </w:t>
+      </w:r>
+      <w:r>
+        <w:rPr>
+          <w:rFonts w:ascii="Arial" w:eastAsia="Arial" w:hAnsi="Arial"/>
+          <w:sz w:val="20"/>
+          <w:szCs w:val="20"/>
+        </w:rPr>
+        <w:t>Panama City</w:t>
+      </w:r>
+      <w:r>
+        <w:rPr>
+          <w:rFonts w:ascii="Arial" w:eastAsia="Arial" w:hAnsi="Arial"/>
+          <w:sz w:val="20"/>
+          <w:szCs w:val="20"/>
+        </w:rPr>
+        <w:t>,</w:t>
+      </w:r>
+      <w:r>
+        <w:rPr>
+          <w:rFonts w:ascii="Arial" w:eastAsia="Arial" w:hAnsi="Arial"/>
+          <w:sz w:val="20"/>
+          <w:szCs w:val="20"/>
+        </w:rPr>
+        <w:t xml:space="preserve"> Panamá</w:t>
+      </w:r>
       <w:r>
         <w:rPr>
           <w:rFonts w:ascii="Arial" w:eastAsia="Arial" w:hAnsi="Arial"/>
@@ -660,223 +721,60 @@
       <w:r>
         <w:rPr>
           <w:rFonts w:ascii="Arial" w:eastAsia="Arial" w:hAnsi="Arial"/>
-          <w:b/>
-          <w:bCs/>
-          <w:sz w:val="20"/>
-          <w:szCs w:val="20"/>
-        </w:rPr>
-        <w:t>Tunnelling Services Panama Corp.</w:t>
-      </w:r>
-      <w:r>
-        <w:rPr>
-          <w:rFonts w:ascii="Arial" w:eastAsia="Arial" w:hAnsi="Arial"/>
-          <w:b/>
-          <w:bCs/>
-          <w:sz w:val="20"/>
-          <w:szCs w:val="20"/>
-        </w:rPr>
-        <w:t xml:space="preserve"> </w:t>
-      </w:r>
-      <w:r>
-        <w:rPr>
-          <w:rFonts w:ascii="Arial" w:eastAsia="Arial" w:hAnsi="Arial"/>
-          <w:b/>
-          <w:bCs/>
-          <w:sz w:val="20"/>
-          <w:szCs w:val="20"/>
-        </w:rPr>
-        <w:tab/>
-      </w:r>
-      <w:r>
-        <w:rPr>
-          <w:rFonts w:ascii="Arial" w:eastAsia="Arial" w:hAnsi="Arial"/>
-          <w:b/>
-          <w:bCs/>
-          <w:sz w:val="20"/>
-          <w:szCs w:val="20"/>
-        </w:rPr>
-        <w:tab/>
-      </w:r>
-      <w:r>
-        <w:rPr>
-          <w:rFonts w:ascii="Arial" w:eastAsia="Arial" w:hAnsi="Arial"/>
-          <w:b/>
-          <w:bCs/>
-          <w:sz w:val="20"/>
-          <w:szCs w:val="20"/>
-        </w:rPr>
-        <w:tab/>
-      </w:r>
-      <w:r>
-        <w:rPr>
-          <w:rFonts w:ascii="Arial" w:eastAsia="Arial" w:hAnsi="Arial"/>
-          <w:b/>
-          <w:bCs/>
-          <w:sz w:val="20"/>
-          <w:szCs w:val="20"/>
-        </w:rPr>
-        <w:tab/>
-      </w:r>
-      <w:r>
-        <w:rPr>
-          <w:rFonts w:ascii="Arial" w:eastAsia="Arial" w:hAnsi="Arial"/>
-          <w:b/>
-          <w:bCs/>
-          <w:sz w:val="20"/>
-          <w:szCs w:val="20"/>
-        </w:rPr>
-        <w:tab/>
-      </w:r>
-      <w:r>
-        <w:rPr>
-          <w:rFonts w:ascii="Arial" w:eastAsia="Arial" w:hAnsi="Arial"/>
-          <w:b/>
-          <w:bCs/>
-          <w:sz w:val="20"/>
-          <w:szCs w:val="20"/>
-        </w:rPr>
-        <w:t xml:space="preserve">            </w:t>
-      </w:r>
-      <w:r>
-        <w:rPr>
-          <w:rFonts w:ascii="Arial" w:eastAsia="Arial" w:hAnsi="Arial"/>
-          <w:sz w:val="20"/>
-          <w:szCs w:val="20"/>
-        </w:rPr>
-        <w:t>Panama City</w:t>
-      </w:r>
-      <w:r>
-        <w:rPr>
-          <w:rFonts w:ascii="Arial" w:eastAsia="Arial" w:hAnsi="Arial"/>
-          <w:sz w:val="20"/>
-          <w:szCs w:val="20"/>
-        </w:rPr>
-        <w:t>,</w:t>
-      </w:r>
-      <w:r>
-        <w:rPr>
-          <w:rFonts w:ascii="Arial" w:eastAsia="Arial" w:hAnsi="Arial"/>
-          <w:sz w:val="20"/>
-          <w:szCs w:val="20"/>
-        </w:rPr>
-        <w:t xml:space="preserve"> Panamá</w:t>
-      </w:r>
-      <w:r>
-        <w:rPr>
-          <w:rFonts w:ascii="Arial" w:eastAsia="Arial" w:hAnsi="Arial"/>
-          <w:b/>
-          <w:bCs/>
-          <w:sz w:val="20"/>
-          <w:szCs w:val="20"/>
-        </w:rPr>
-        <w:t xml:space="preserve"> </w:t>
-      </w:r>
-      <w:r>
-        <w:rPr>
-          <w:rFonts w:ascii="Arial" w:eastAsia="Arial" w:hAnsi="Arial"/>
-          <w:sz w:val="20"/>
-          <w:szCs w:val="20"/>
-        </w:rPr>
-        <w:t>Project Engineer</w:t>
-      </w:r>
-      <w:r>
-        <w:rPr>
-          <w:rFonts w:ascii="Arial" w:eastAsia="Arial" w:hAnsi="Arial"/>
-          <w:b/>
-          <w:bCs/>
-          <w:sz w:val="20"/>
-          <w:szCs w:val="20"/>
-        </w:rPr>
-        <w:tab/>
-      </w:r>
-      <w:r>
-        <w:rPr>
-          <w:rFonts w:ascii="Arial" w:eastAsia="Arial" w:hAnsi="Arial"/>
-          <w:b/>
-          <w:bCs/>
-          <w:sz w:val="20"/>
-          <w:szCs w:val="20"/>
-        </w:rPr>
-        <w:tab/>
-      </w:r>
-      <w:r>
-        <w:rPr>
-          <w:rFonts w:ascii="Arial" w:eastAsia="Arial" w:hAnsi="Arial"/>
-          <w:b/>
-          <w:bCs/>
-          <w:sz w:val="20"/>
-          <w:szCs w:val="20"/>
-        </w:rPr>
-        <w:tab/>
-      </w:r>
-      <w:r>
-        <w:rPr>
-          <w:rFonts w:ascii="Arial" w:eastAsia="Arial" w:hAnsi="Arial"/>
-          <w:b/>
-          <w:bCs/>
-          <w:sz w:val="20"/>
-          <w:szCs w:val="20"/>
-        </w:rPr>
-        <w:t xml:space="preserve"> </w:t>
-      </w:r>
-      <w:r>
-        <w:rPr>
-          <w:rFonts w:ascii="Arial" w:eastAsia="Arial" w:hAnsi="Arial"/>
-          <w:b/>
-          <w:bCs/>
-          <w:sz w:val="20"/>
-          <w:szCs w:val="20"/>
-        </w:rPr>
-        <w:tab/>
-      </w:r>
-      <w:r>
-        <w:rPr>
-          <w:rFonts w:ascii="Arial" w:eastAsia="Arial" w:hAnsi="Arial"/>
-          <w:b/>
-          <w:bCs/>
-          <w:sz w:val="20"/>
-          <w:szCs w:val="20"/>
-        </w:rPr>
-        <w:tab/>
-      </w:r>
-      <w:r>
-        <w:rPr>
-          <w:rFonts w:ascii="Arial" w:eastAsia="Arial" w:hAnsi="Arial"/>
-          <w:b/>
-          <w:bCs/>
-          <w:sz w:val="20"/>
-          <w:szCs w:val="20"/>
-        </w:rPr>
-        <w:tab/>
-      </w:r>
-      <w:r>
-        <w:rPr>
-          <w:rFonts w:ascii="Arial" w:eastAsia="Arial" w:hAnsi="Arial"/>
-          <w:b/>
-          <w:bCs/>
-          <w:sz w:val="20"/>
-          <w:szCs w:val="20"/>
-        </w:rPr>
-        <w:tab/>
-      </w:r>
-      <w:r>
-        <w:rPr>
-          <w:rFonts w:ascii="Arial" w:eastAsia="Arial" w:hAnsi="Arial"/>
-          <w:b/>
-          <w:bCs/>
-          <w:sz w:val="20"/>
-          <w:szCs w:val="20"/>
-        </w:rPr>
-        <w:tab/>
-      </w:r>
-      <w:r>
-        <w:rPr>
-          <w:rFonts w:ascii="Arial" w:eastAsia="Arial" w:hAnsi="Arial"/>
-          <w:b/>
-          <w:bCs/>
-          <w:sz w:val="20"/>
-          <w:szCs w:val="20"/>
-        </w:rPr>
+          <w:sz w:val="20"/>
+          <w:szCs w:val="20"/>
+        </w:rPr>
+        <w:t>Co-Founder &amp; Director of Systems Engineering</w:t>
+      </w:r>
+      <w:r>
+        <w:rPr>
+          <w:rFonts w:ascii="Arial" w:eastAsia="Arial" w:hAnsi="Arial"/>
+          <w:b/>
+          <w:bCs/>
+          <w:sz w:val="20"/>
+          <w:szCs w:val="20"/>
+        </w:rPr>
+        <w:tab/>
+      </w:r>
+      <w:r>
+        <w:rPr>
+          <w:rFonts w:ascii="Arial" w:eastAsia="Arial" w:hAnsi="Arial"/>
+          <w:b/>
+          <w:bCs/>
+          <w:sz w:val="20"/>
+          <w:szCs w:val="20"/>
+        </w:rPr>
+        <w:tab/>
+      </w:r>
+      <w:r>
+        <w:rPr>
+          <w:rFonts w:ascii="Arial" w:eastAsia="Arial" w:hAnsi="Arial"/>
+          <w:b/>
+          <w:bCs/>
+          <w:sz w:val="20"/>
+          <w:szCs w:val="20"/>
+        </w:rPr>
+        <w:tab/>
+      </w:r>
+      <w:r>
+        <w:rPr>
+          <w:rFonts w:ascii="Arial" w:eastAsia="Arial" w:hAnsi="Arial"/>
+          <w:b/>
+          <w:bCs/>
+          <w:sz w:val="20"/>
+          <w:szCs w:val="20"/>
+        </w:rPr>
+        <w:tab/>
+      </w:r>
+      <w:r>
+        <w:rPr>
+          <w:rFonts w:ascii="Arial" w:eastAsia="Arial" w:hAnsi="Arial"/>
+          <w:b/>
+          <w:bCs/>
+          <w:sz w:val="20"/>
+          <w:szCs w:val="20"/>
+        </w:rPr>
+        <w:tab/>
         <w:t xml:space="preserve">    </w:t>
       </w:r>
       <w:r>
@@ -915,6 +813,431 @@
           <w:szCs w:val="18"/>
         </w:rPr>
         <w:t>025</w:t>
+      </w:r>
+    </w:p>
+    <w:p>
+      <w:pPr>
+        <w:spacing w:line="240" w:lineRule="auto"/>
+        <w:rPr>
+          <w:rFonts w:ascii="Arial" w:eastAsia="Arial" w:hAnsi="Arial"/>
+          <w:sz w:val="20"/>
+          <w:szCs w:val="20"/>
+        </w:rPr>
+      </w:pPr>
+      <w:r>
+        <w:rPr>
+          <w:rFonts w:ascii="Arial" w:hAnsi="Arial" w:cs="Arial"/>
+          <w:b/>
+          <w:bCs/>
+          <w:sz w:val="20"/>
+          <w:szCs w:val="20"/>
+        </w:rPr>
+        <w:t xml:space="preserve">• </w:t>
+      </w:r>
+      <w:r>
+        <w:rPr>
+          <w:rFonts w:ascii="Arial" w:hAnsi="Arial" w:cs="Arial"/>
+          <w:b/>
+          <w:bCs/>
+          <w:sz w:val="20"/>
+          <w:szCs w:val="20"/>
+        </w:rPr>
+        <w:t xml:space="preserve"> </w:t>
+      </w:r>
+      <w:r>
+        <w:rPr>
+          <w:rFonts w:ascii="Arial" w:eastAsia="Arial" w:hAnsi="Arial"/>
+          <w:sz w:val="20"/>
+          <w:szCs w:val="20"/>
+        </w:rPr>
+        <w:t>Implemented MBSE methodologies to define the company’s operational architecture, ensuring full alignment between technical R&amp;D requirements and the core business model.</w:t>
+      </w:r>
+    </w:p>
+    <w:p>
+      <w:pPr>
+        <w:spacing w:line="240" w:lineRule="auto"/>
+        <w:rPr>
+          <w:rFonts w:ascii="Arial" w:hAnsi="Arial" w:cs="Arial"/>
+          <w:sz w:val="20"/>
+          <w:szCs w:val="20"/>
+        </w:rPr>
+      </w:pPr>
+      <w:r>
+        <w:rPr>
+          <w:rFonts w:ascii="Arial" w:hAnsi="Arial" w:cs="Arial"/>
+          <w:b/>
+          <w:bCs/>
+          <w:sz w:val="20"/>
+          <w:szCs w:val="20"/>
+        </w:rPr>
+        <w:t>•</w:t>
+      </w:r>
+      <w:r>
+        <w:rPr>
+          <w:rFonts w:ascii="Arial" w:hAnsi="Arial" w:cs="Arial"/>
+          <w:b/>
+          <w:bCs/>
+          <w:sz w:val="20"/>
+          <w:szCs w:val="20"/>
+        </w:rPr>
+        <w:t xml:space="preserve"> </w:t>
+      </w:r>
+      <w:r>
+        <w:rPr>
+          <w:rFonts w:ascii="Arial" w:hAnsi="Arial" w:cs="Arial"/>
+          <w:sz w:val="20"/>
+          <w:szCs w:val="20"/>
+        </w:rPr>
+        <w:t>Designed and integrated digital workflows within the customer acquisition system, significantly reducing operational friction during early-stage lead generation while maintaining end-to-end prospect traceability.</w:t>
+      </w:r>
+    </w:p>
+    <w:p>
+      <w:pPr>
+        <w:spacing w:line="240" w:lineRule="auto"/>
+        <w:rPr>
+          <w:rFonts w:ascii="Arial" w:hAnsi="Arial" w:cs="Arial"/>
+          <w:sz w:val="20"/>
+          <w:szCs w:val="20"/>
+        </w:rPr>
+      </w:pPr>
+      <w:r>
+        <w:rPr>
+          <w:rFonts w:ascii="Arial" w:hAnsi="Arial" w:cs="Arial"/>
+          <w:b/>
+          <w:bCs/>
+          <w:sz w:val="20"/>
+          <w:szCs w:val="20"/>
+        </w:rPr>
+        <w:t xml:space="preserve">• </w:t>
+      </w:r>
+      <w:r>
+        <w:rPr>
+          <w:rFonts w:ascii="Arial" w:hAnsi="Arial" w:cs="Arial"/>
+          <w:sz w:val="20"/>
+          <w:szCs w:val="20"/>
+        </w:rPr>
+        <w:t>Developed cost-analysis models and systemic frameworks to optimize resource allocation, transforming complex technical operations into scalable and profitable business workflows</w:t>
+      </w:r>
+    </w:p>
+    <w:p>
+      <w:pPr>
+        <w:spacing w:line="240" w:lineRule="auto"/>
+        <w:rPr>
+          <w:rFonts w:ascii="Arial" w:eastAsia="Arial" w:hAnsi="Arial"/>
+          <w:sz w:val="12"/>
+          <w:szCs w:val="12"/>
+        </w:rPr>
+      </w:pPr>
+    </w:p>
+    <w:p>
+      <w:pPr>
+        <w:spacing w:line="240" w:lineRule="auto"/>
+        <w:rPr>
+          <w:rFonts w:ascii="Arial" w:eastAsia="Arial" w:hAnsi="Arial"/>
+          <w:b/>
+          <w:bCs/>
+          <w:sz w:val="20"/>
+          <w:szCs w:val="20"/>
+        </w:rPr>
+      </w:pPr>
+      <w:r>
+        <w:rPr>
+          <w:rFonts w:ascii="Arial" w:eastAsia="Arial" w:hAnsi="Arial"/>
+          <w:b/>
+          <w:bCs/>
+          <w:sz w:val="20"/>
+          <w:szCs w:val="20"/>
+        </w:rPr>
+        <w:t xml:space="preserve">Herrenknecht </w:t>
+      </w:r>
+      <w:r>
+        <w:rPr>
+          <w:rFonts w:ascii="Arial" w:eastAsia="Arial" w:hAnsi="Arial"/>
+          <w:b/>
+          <w:bCs/>
+          <w:sz w:val="20"/>
+          <w:szCs w:val="20"/>
+        </w:rPr>
+        <w:t>Tunnelling Services Panama Corp.</w:t>
+      </w:r>
+      <w:r>
+        <w:rPr>
+          <w:rFonts w:ascii="Arial" w:eastAsia="Arial" w:hAnsi="Arial"/>
+          <w:b/>
+          <w:bCs/>
+          <w:sz w:val="20"/>
+          <w:szCs w:val="20"/>
+        </w:rPr>
+        <w:t xml:space="preserve"> </w:t>
+      </w:r>
+      <w:r>
+        <w:rPr>
+          <w:rFonts w:ascii="Arial" w:eastAsia="Arial" w:hAnsi="Arial"/>
+          <w:b/>
+          <w:bCs/>
+          <w:sz w:val="20"/>
+          <w:szCs w:val="20"/>
+        </w:rPr>
+        <w:tab/>
+      </w:r>
+      <w:r>
+        <w:rPr>
+          <w:rFonts w:ascii="Arial" w:eastAsia="Arial" w:hAnsi="Arial"/>
+          <w:b/>
+          <w:bCs/>
+          <w:sz w:val="20"/>
+          <w:szCs w:val="20"/>
+        </w:rPr>
+        <w:tab/>
+      </w:r>
+      <w:r>
+        <w:rPr>
+          <w:rFonts w:ascii="Arial" w:eastAsia="Arial" w:hAnsi="Arial"/>
+          <w:b/>
+          <w:bCs/>
+          <w:sz w:val="20"/>
+          <w:szCs w:val="20"/>
+        </w:rPr>
+        <w:tab/>
+      </w:r>
+      <w:r>
+        <w:rPr>
+          <w:rFonts w:ascii="Arial" w:eastAsia="Arial" w:hAnsi="Arial"/>
+          <w:b/>
+          <w:bCs/>
+          <w:sz w:val="20"/>
+          <w:szCs w:val="20"/>
+        </w:rPr>
+        <w:tab/>
+      </w:r>
+      <w:r>
+        <w:rPr>
+          <w:rFonts w:ascii="Arial" w:eastAsia="Arial" w:hAnsi="Arial"/>
+          <w:b/>
+          <w:bCs/>
+          <w:sz w:val="20"/>
+          <w:szCs w:val="20"/>
+        </w:rPr>
+        <w:tab/>
+      </w:r>
+      <w:r>
+        <w:rPr>
+          <w:rFonts w:ascii="Arial" w:eastAsia="Arial" w:hAnsi="Arial"/>
+          <w:b/>
+          <w:bCs/>
+          <w:sz w:val="20"/>
+          <w:szCs w:val="20"/>
+        </w:rPr>
+        <w:t xml:space="preserve">            </w:t>
+      </w:r>
+      <w:r>
+        <w:rPr>
+          <w:rFonts w:ascii="Arial" w:eastAsia="Arial" w:hAnsi="Arial"/>
+          <w:sz w:val="20"/>
+          <w:szCs w:val="20"/>
+        </w:rPr>
+        <w:t>Panama City</w:t>
+      </w:r>
+      <w:r>
+        <w:rPr>
+          <w:rFonts w:ascii="Arial" w:eastAsia="Arial" w:hAnsi="Arial"/>
+          <w:sz w:val="20"/>
+          <w:szCs w:val="20"/>
+        </w:rPr>
+        <w:t>,</w:t>
+      </w:r>
+      <w:r>
+        <w:rPr>
+          <w:rFonts w:ascii="Arial" w:eastAsia="Arial" w:hAnsi="Arial"/>
+          <w:sz w:val="20"/>
+          <w:szCs w:val="20"/>
+        </w:rPr>
+        <w:t xml:space="preserve"> Panamá</w:t>
+      </w:r>
+      <w:r>
+        <w:rPr>
+          <w:rFonts w:ascii="Arial" w:eastAsia="Arial" w:hAnsi="Arial"/>
+          <w:b/>
+          <w:bCs/>
+          <w:sz w:val="20"/>
+          <w:szCs w:val="20"/>
+        </w:rPr>
+        <w:t xml:space="preserve"> </w:t>
+      </w:r>
+      <w:r>
+        <w:rPr>
+          <w:rFonts w:ascii="Arial" w:eastAsia="Arial" w:hAnsi="Arial"/>
+          <w:sz w:val="20"/>
+          <w:szCs w:val="20"/>
+        </w:rPr>
+        <w:t>Project Engineer</w:t>
+      </w:r>
+      <w:r>
+        <w:rPr>
+          <w:rFonts w:ascii="Arial" w:eastAsia="Arial" w:hAnsi="Arial"/>
+          <w:b/>
+          <w:bCs/>
+          <w:sz w:val="20"/>
+          <w:szCs w:val="20"/>
+        </w:rPr>
+        <w:tab/>
+      </w:r>
+      <w:r>
+        <w:rPr>
+          <w:rFonts w:ascii="Arial" w:eastAsia="Arial" w:hAnsi="Arial"/>
+          <w:b/>
+          <w:bCs/>
+          <w:sz w:val="20"/>
+          <w:szCs w:val="20"/>
+        </w:rPr>
+        <w:tab/>
+      </w:r>
+      <w:r>
+        <w:rPr>
+          <w:rFonts w:ascii="Arial" w:eastAsia="Arial" w:hAnsi="Arial"/>
+          <w:b/>
+          <w:bCs/>
+          <w:sz w:val="20"/>
+          <w:szCs w:val="20"/>
+        </w:rPr>
+        <w:tab/>
+      </w:r>
+      <w:r>
+        <w:rPr>
+          <w:rFonts w:ascii="Arial" w:eastAsia="Arial" w:hAnsi="Arial"/>
+          <w:b/>
+          <w:bCs/>
+          <w:sz w:val="20"/>
+          <w:szCs w:val="20"/>
+        </w:rPr>
+        <w:t xml:space="preserve"> </w:t>
+      </w:r>
+      <w:r>
+        <w:rPr>
+          <w:rFonts w:ascii="Arial" w:eastAsia="Arial" w:hAnsi="Arial"/>
+          <w:b/>
+          <w:bCs/>
+          <w:sz w:val="20"/>
+          <w:szCs w:val="20"/>
+        </w:rPr>
+        <w:tab/>
+      </w:r>
+      <w:r>
+        <w:rPr>
+          <w:rFonts w:ascii="Arial" w:eastAsia="Arial" w:hAnsi="Arial"/>
+          <w:b/>
+          <w:bCs/>
+          <w:sz w:val="20"/>
+          <w:szCs w:val="20"/>
+        </w:rPr>
+        <w:tab/>
+      </w:r>
+      <w:r>
+        <w:rPr>
+          <w:rFonts w:ascii="Arial" w:eastAsia="Arial" w:hAnsi="Arial"/>
+          <w:b/>
+          <w:bCs/>
+          <w:sz w:val="20"/>
+          <w:szCs w:val="20"/>
+        </w:rPr>
+        <w:tab/>
+      </w:r>
+      <w:r>
+        <w:rPr>
+          <w:rFonts w:ascii="Arial" w:eastAsia="Arial" w:hAnsi="Arial"/>
+          <w:b/>
+          <w:bCs/>
+          <w:sz w:val="20"/>
+          <w:szCs w:val="20"/>
+        </w:rPr>
+        <w:tab/>
+      </w:r>
+      <w:r>
+        <w:rPr>
+          <w:rFonts w:ascii="Arial" w:eastAsia="Arial" w:hAnsi="Arial"/>
+          <w:b/>
+          <w:bCs/>
+          <w:sz w:val="20"/>
+          <w:szCs w:val="20"/>
+        </w:rPr>
+        <w:tab/>
+      </w:r>
+      <w:r>
+        <w:rPr>
+          <w:rFonts w:ascii="Arial" w:eastAsia="Arial" w:hAnsi="Arial"/>
+          <w:b/>
+          <w:bCs/>
+          <w:sz w:val="20"/>
+          <w:szCs w:val="20"/>
+        </w:rPr>
+        <w:t xml:space="preserve">    </w:t>
+      </w:r>
+      <w:r>
+        <w:rPr>
+          <w:rFonts w:ascii="Arial" w:eastAsia="Arial" w:hAnsi="Arial"/>
+          <w:b/>
+          <w:bCs/>
+          <w:sz w:val="20"/>
+          <w:szCs w:val="20"/>
+        </w:rPr>
+        <w:tab/>
+      </w:r>
+      <w:r>
+        <w:rPr>
+          <w:rFonts w:ascii="Arial" w:eastAsia="Arial" w:hAnsi="Arial"/>
+          <w:b/>
+          <w:bCs/>
+          <w:sz w:val="20"/>
+          <w:szCs w:val="20"/>
+        </w:rPr>
+        <w:tab/>
+        <w:t xml:space="preserve">      </w:t>
+      </w:r>
+      <w:r>
+        <w:rPr>
+          <w:rFonts w:ascii="Arial" w:eastAsia="Arial" w:hAnsi="Arial"/>
+          <w:sz w:val="18"/>
+          <w:szCs w:val="18"/>
+        </w:rPr>
+        <w:t>Jan 2025 – Jul 2</w:t>
+      </w:r>
+      <w:r>
+        <w:rPr>
+          <w:rFonts w:ascii="Arial" w:eastAsia="Arial" w:hAnsi="Arial"/>
+          <w:sz w:val="18"/>
+          <w:szCs w:val="18"/>
+        </w:rPr>
+        <w:t>025</w:t>
+      </w:r>
+    </w:p>
+    <w:p>
+      <w:pPr>
+        <w:spacing w:line="240" w:lineRule="auto"/>
+        <w:rPr>
+          <w:rFonts w:ascii="Arial" w:eastAsia="Arial" w:hAnsi="Arial"/>
+          <w:b/>
+          <w:bCs/>
+          <w:sz w:val="20"/>
+          <w:szCs w:val="20"/>
+        </w:rPr>
+      </w:pPr>
+      <w:r>
+        <w:rPr>
+          <w:rFonts w:ascii="Arial" w:hAnsi="Arial" w:cs="Arial"/>
+          <w:b/>
+          <w:bCs/>
+          <w:sz w:val="20"/>
+          <w:szCs w:val="20"/>
+        </w:rPr>
+        <w:t xml:space="preserve">• </w:t>
+      </w:r>
+      <w:r>
+        <w:rPr>
+          <w:rFonts w:ascii="Arial" w:hAnsi="Arial" w:cs="Arial"/>
+          <w:sz w:val="20"/>
+          <w:szCs w:val="20"/>
+        </w:rPr>
+        <w:t>Designed and documented the global SOP for race replacement in the Main Drive of EPB TBM machines.</w:t>
       </w:r>
     </w:p>
     <w:p>
@@ -926,55 +1249,31 @@
         <w:jc w:val="both"/>
         <w:rPr>
           <w:rFonts w:ascii="Arial" w:hAnsi="Arial" w:cs="Arial"/>
-          <w:b/>
-          <w:bCs/>
-        </w:rPr>
-      </w:pPr>
-      <w:r>
-        <w:rPr>
-          <w:rFonts w:ascii="Arial" w:hAnsi="Arial" w:cs="Arial"/>
-        </w:rPr>
-        <w:tab/>
-      </w:r>
-      <w:r>
-        <w:rPr>
-          <w:rFonts w:ascii="Arial" w:hAnsi="Arial" w:cs="Arial"/>
-          <w:b/>
-          <w:bCs/>
-          <w:sz w:val="20"/>
-          <w:szCs w:val="20"/>
-        </w:rPr>
-        <w:t>Per</w:t>
-      </w:r>
-      <w:r>
-        <w:rPr>
-          <w:rFonts w:ascii="Arial" w:hAnsi="Arial" w:cs="Arial"/>
-          <w:b/>
-          <w:bCs/>
-          <w:sz w:val="20"/>
-          <w:szCs w:val="20"/>
-        </w:rPr>
-        <w:t>ú</w:t>
-      </w:r>
-      <w:r>
-        <w:rPr>
-          <w:rFonts w:ascii="Arial" w:hAnsi="Arial" w:cs="Arial"/>
-          <w:b/>
-          <w:bCs/>
-          <w:sz w:val="20"/>
-          <w:szCs w:val="20"/>
-        </w:rPr>
-        <w:t xml:space="preserve"> Operation (3 months)</w:t>
-      </w:r>
-      <w:r>
-        <w:rPr>
-          <w:rFonts w:ascii="Arial" w:hAnsi="Arial" w:cs="Arial"/>
-          <w:b/>
-          <w:bCs/>
-          <w:sz w:val="20"/>
-          <w:szCs w:val="20"/>
-        </w:rPr>
-        <w:t xml:space="preserve"> – On site</w:t>
+          <w:sz w:val="20"/>
+          <w:szCs w:val="20"/>
+        </w:rPr>
+      </w:pPr>
+      <w:r>
+        <w:rPr>
+          <w:rFonts w:ascii="Arial" w:hAnsi="Arial" w:cs="Arial"/>
+        </w:rPr>
+        <w:t>•</w:t>
+      </w:r>
+      <w:r>
+        <w:rPr>
+          <w:rFonts w:ascii="Arial" w:hAnsi="Arial" w:cs="Arial"/>
+          <w:sz w:val="20"/>
+          <w:szCs w:val="20"/>
+        </w:rPr>
+        <w:t xml:space="preserve"> </w:t>
+      </w:r>
+      <w:r>
+        <w:rPr>
+          <w:rFonts w:ascii="Arial" w:hAnsi="Arial" w:cs="Arial"/>
+          <w:sz w:val="20"/>
+          <w:szCs w:val="20"/>
+        </w:rPr>
+        <w:t>Performed structural calculation validation and functional analysis of mechanical systems, ensuring strength and safety in high-demand industrial environments according to site conditions.</w:t>
       </w:r>
     </w:p>
     <w:p>
@@ -993,58 +1292,42 @@
       <w:r>
         <w:rPr>
           <w:rFonts w:ascii="Arial" w:hAnsi="Arial" w:cs="Arial"/>
-          <w:b/>
-          <w:bCs/>
-          <w:sz w:val="20"/>
-          <w:szCs w:val="20"/>
-        </w:rPr>
-        <w:t xml:space="preserve">• </w:t>
-      </w:r>
-      <w:r>
-        <w:rPr>
-          <w:rFonts w:ascii="Arial" w:hAnsi="Arial" w:cs="Arial"/>
-          <w:sz w:val="20"/>
-          <w:szCs w:val="20"/>
-        </w:rPr>
-        <w:t xml:space="preserve">Managed on-site engineering activities for TBM component replacement, coordinating logistics and quality checks that reduced assembly time by </w:t>
-      </w:r>
-      <w:r>
-        <w:rPr>
-          <w:rFonts w:ascii="Arial" w:hAnsi="Arial" w:cs="Arial"/>
-          <w:b/>
-          <w:bCs/>
-          <w:sz w:val="20"/>
-          <w:szCs w:val="20"/>
-        </w:rPr>
-        <w:t>10%</w:t>
-      </w:r>
-      <w:r>
-        <w:rPr>
-          <w:rFonts w:ascii="Arial" w:hAnsi="Arial" w:cs="Arial"/>
-          <w:sz w:val="20"/>
-          <w:szCs w:val="20"/>
-        </w:rPr>
-        <w:t xml:space="preserve"> and ensured </w:t>
-      </w:r>
-      <w:r>
-        <w:rPr>
-          <w:rFonts w:ascii="Arial" w:hAnsi="Arial" w:cs="Arial"/>
-          <w:b/>
-          <w:bCs/>
-          <w:sz w:val="20"/>
-          <w:szCs w:val="20"/>
-        </w:rPr>
-        <w:t>zero operational delays</w:t>
-      </w:r>
-      <w:r>
-        <w:rPr>
-          <w:rFonts w:ascii="Arial" w:hAnsi="Arial" w:cs="Arial"/>
-          <w:b/>
-          <w:bCs/>
-          <w:sz w:val="20"/>
-          <w:szCs w:val="20"/>
-        </w:rPr>
-        <w:t>.</w:t>
+        </w:rPr>
+        <w:t>•</w:t>
+      </w:r>
+      <w:r>
+        <w:rPr>
+          <w:rFonts w:ascii="Arial" w:hAnsi="Arial" w:cs="Arial"/>
+          <w:sz w:val="20"/>
+          <w:szCs w:val="20"/>
+        </w:rPr>
+        <w:t xml:space="preserve"> </w:t>
+      </w:r>
+      <w:r>
+        <w:rPr>
+          <w:rFonts w:ascii="Arial" w:hAnsi="Arial" w:cs="Arial"/>
+          <w:sz w:val="20"/>
+          <w:szCs w:val="20"/>
+        </w:rPr>
+        <w:t xml:space="preserve">Guaranteed 100% regulatory compliance and documentary traceability, mitigating contractual fine risks for the Lima Metro and </w:t>
+      </w:r>
+      <w:proofErr w:type="spellStart"/>
+      <w:r>
+        <w:rPr>
+          <w:rFonts w:ascii="Arial" w:hAnsi="Arial" w:cs="Arial"/>
+          <w:sz w:val="20"/>
+          <w:szCs w:val="20"/>
+        </w:rPr>
+        <w:t>Paladise</w:t>
+      </w:r>
+      <w:proofErr w:type="spellEnd"/>
+      <w:r>
+        <w:rPr>
+          <w:rFonts w:ascii="Arial" w:hAnsi="Arial" w:cs="Arial"/>
+          <w:sz w:val="20"/>
+          <w:szCs w:val="20"/>
+        </w:rPr>
+        <w:t xml:space="preserve"> Tunnel projects.</w:t>
       </w:r>
     </w:p>
     <w:p>
@@ -1056,43 +1339,51 @@
         <w:jc w:val="both"/>
         <w:rPr>
           <w:rFonts w:ascii="Arial" w:hAnsi="Arial" w:cs="Arial"/>
-          <w:sz w:val="20"/>
-          <w:szCs w:val="20"/>
-        </w:rPr>
-      </w:pPr>
-      <w:r>
-        <w:rPr>
-          <w:rFonts w:ascii="Arial" w:hAnsi="Arial" w:cs="Arial"/>
-          <w:sz w:val="20"/>
-          <w:szCs w:val="20"/>
-        </w:rPr>
-        <w:t xml:space="preserve">• </w:t>
-      </w:r>
-      <w:r>
-        <w:rPr>
-          <w:rFonts w:ascii="Arial" w:hAnsi="Arial" w:cs="Arial"/>
-          <w:sz w:val="20"/>
-          <w:szCs w:val="20"/>
-        </w:rPr>
-        <w:t xml:space="preserve">Executed multi-mode TBM track replacement operation and preventive maintenance on the main drive system, maintaining </w:t>
-      </w:r>
-      <w:r>
-        <w:rPr>
-          <w:rFonts w:ascii="Arial" w:hAnsi="Arial" w:cs="Arial"/>
-          <w:b/>
-          <w:bCs/>
-          <w:sz w:val="20"/>
-          <w:szCs w:val="20"/>
-        </w:rPr>
-        <w:t>100% operational uptime</w:t>
-      </w:r>
-      <w:r>
-        <w:rPr>
-          <w:rFonts w:ascii="Arial" w:hAnsi="Arial" w:cs="Arial"/>
-          <w:sz w:val="20"/>
-          <w:szCs w:val="20"/>
-        </w:rPr>
-        <w:t xml:space="preserve"> during excavation.</w:t>
+          <w:b/>
+          <w:bCs/>
+          <w:sz w:val="18"/>
+          <w:szCs w:val="18"/>
+        </w:rPr>
+      </w:pPr>
+      <w:r>
+        <w:rPr>
+          <w:rFonts w:ascii="Arial" w:hAnsi="Arial" w:cs="Arial"/>
+          <w:b/>
+          <w:bCs/>
+          <w:sz w:val="18"/>
+          <w:szCs w:val="18"/>
+        </w:rPr>
+        <w:t xml:space="preserve">Projects: </w:t>
+      </w:r>
+      <w:r>
+        <w:rPr>
+          <w:rFonts w:ascii="Arial" w:hAnsi="Arial" w:cs="Arial"/>
+          <w:b/>
+          <w:bCs/>
+          <w:sz w:val="18"/>
+          <w:szCs w:val="18"/>
+        </w:rPr>
+        <w:t>Hudson River Project (USA)</w:t>
+      </w:r>
+      <w:r>
+        <w:rPr>
+          <w:rFonts w:ascii="Arial" w:hAnsi="Arial" w:cs="Arial"/>
+          <w:b/>
+          <w:bCs/>
+          <w:sz w:val="18"/>
+          <w:szCs w:val="18"/>
+        </w:rPr>
+        <w:t xml:space="preserve">, Railway Tunnel </w:t>
+      </w:r>
+      <w:r>
+        <w:rPr>
+          <w:rFonts w:ascii="Arial" w:hAnsi="Arial" w:cs="Arial"/>
+          <w:b/>
+          <w:bCs/>
+          <w:sz w:val="18"/>
+          <w:szCs w:val="18"/>
+        </w:rPr>
+        <w:t>Perú</w:t>
       </w:r>
     </w:p>
     <w:p>
@@ -1104,194 +1395,6 @@
         <w:jc w:val="both"/>
         <w:rPr>
           <w:rFonts w:ascii="Arial" w:hAnsi="Arial" w:cs="Arial"/>
-          <w:b/>
-          <w:bCs/>
-          <w:sz w:val="20"/>
-          <w:szCs w:val="20"/>
-        </w:rPr>
-      </w:pPr>
-      <w:r>
-        <w:rPr>
-          <w:rFonts w:ascii="Arial" w:hAnsi="Arial" w:cs="Arial"/>
-          <w:sz w:val="20"/>
-          <w:szCs w:val="20"/>
-        </w:rPr>
-        <w:tab/>
-      </w:r>
-      <w:r>
-        <w:rPr>
-          <w:rFonts w:ascii="Arial" w:hAnsi="Arial" w:cs="Arial"/>
-          <w:b/>
-          <w:bCs/>
-          <w:sz w:val="20"/>
-          <w:szCs w:val="20"/>
-        </w:rPr>
-        <w:t xml:space="preserve">Germany (4 months) </w:t>
-      </w:r>
-      <w:r>
-        <w:rPr>
-          <w:rFonts w:ascii="Arial" w:hAnsi="Arial" w:cs="Arial"/>
-          <w:b/>
-          <w:bCs/>
-          <w:sz w:val="20"/>
-          <w:szCs w:val="20"/>
-        </w:rPr>
-        <w:t xml:space="preserve">- </w:t>
-      </w:r>
-      <w:r>
-        <w:rPr>
-          <w:rFonts w:ascii="Arial" w:hAnsi="Arial" w:cs="Arial"/>
-          <w:b/>
-          <w:bCs/>
-          <w:sz w:val="20"/>
-          <w:szCs w:val="20"/>
-        </w:rPr>
-        <w:t xml:space="preserve">Hudson River </w:t>
-      </w:r>
-      <w:r>
-        <w:rPr>
-          <w:rFonts w:ascii="Arial" w:hAnsi="Arial" w:cs="Arial"/>
-          <w:b/>
-          <w:bCs/>
-          <w:sz w:val="20"/>
-          <w:szCs w:val="20"/>
-        </w:rPr>
-        <w:t>P</w:t>
-      </w:r>
-      <w:r>
-        <w:rPr>
-          <w:rFonts w:ascii="Arial" w:hAnsi="Arial" w:cs="Arial"/>
-          <w:b/>
-          <w:bCs/>
-          <w:sz w:val="20"/>
-          <w:szCs w:val="20"/>
-        </w:rPr>
-        <w:t>roject (USA)</w:t>
-      </w:r>
-      <w:r>
-        <w:rPr>
-          <w:rFonts w:ascii="Arial" w:hAnsi="Arial" w:cs="Arial"/>
-          <w:b/>
-          <w:bCs/>
-          <w:sz w:val="20"/>
-          <w:szCs w:val="20"/>
-        </w:rPr>
-        <w:t xml:space="preserve"> – On site</w:t>
-      </w:r>
-    </w:p>
-    <w:p>
-      <w:pPr>
-        <w:pBdr>
-          <w:bottom w:val="single" w:sz="6" w:space="1" w:color="auto"/>
-        </w:pBdr>
-        <w:spacing w:line="240" w:lineRule="auto"/>
-        <w:jc w:val="both"/>
-        <w:rPr>
-          <w:rFonts w:ascii="Arial" w:hAnsi="Arial" w:cs="Arial"/>
-          <w:sz w:val="20"/>
-          <w:szCs w:val="20"/>
-        </w:rPr>
-      </w:pPr>
-      <w:r>
-        <w:rPr>
-          <w:rFonts w:ascii="Arial" w:hAnsi="Arial" w:cs="Arial"/>
-          <w:sz w:val="20"/>
-          <w:szCs w:val="20"/>
-        </w:rPr>
-        <w:t xml:space="preserve">• </w:t>
-      </w:r>
-      <w:r>
-        <w:rPr>
-          <w:rFonts w:ascii="Arial" w:hAnsi="Arial" w:cs="Arial"/>
-          <w:sz w:val="20"/>
-          <w:szCs w:val="20"/>
-        </w:rPr>
-        <w:t xml:space="preserve">Produced FAT reports and design optimization recommendations adopted by project teams, improving assembly accuracy by </w:t>
-      </w:r>
-      <w:r>
-        <w:rPr>
-          <w:rFonts w:ascii="Arial" w:hAnsi="Arial" w:cs="Arial"/>
-          <w:b/>
-          <w:bCs/>
-          <w:sz w:val="20"/>
-          <w:szCs w:val="20"/>
-        </w:rPr>
-        <w:t>15%</w:t>
-      </w:r>
-      <w:r>
-        <w:rPr>
-          <w:rFonts w:ascii="Arial" w:hAnsi="Arial" w:cs="Arial"/>
-          <w:sz w:val="20"/>
-          <w:szCs w:val="20"/>
-        </w:rPr>
-        <w:t xml:space="preserve"> and ensuring </w:t>
-      </w:r>
-      <w:r>
-        <w:rPr>
-          <w:rFonts w:ascii="Arial" w:hAnsi="Arial" w:cs="Arial"/>
-          <w:b/>
-          <w:bCs/>
-          <w:sz w:val="20"/>
-          <w:szCs w:val="20"/>
-        </w:rPr>
-        <w:t>compliance with international FAT standards</w:t>
-      </w:r>
-      <w:r>
-        <w:rPr>
-          <w:rFonts w:ascii="Arial" w:hAnsi="Arial" w:cs="Arial"/>
-          <w:sz w:val="20"/>
-          <w:szCs w:val="20"/>
-        </w:rPr>
-        <w:t>.</w:t>
-      </w:r>
-    </w:p>
-    <w:p>
-      <w:pPr>
-        <w:pBdr>
-          <w:bottom w:val="single" w:sz="6" w:space="1" w:color="auto"/>
-        </w:pBdr>
-        <w:spacing w:line="240" w:lineRule="auto"/>
-        <w:jc w:val="both"/>
-        <w:rPr>
-          <w:rFonts w:ascii="Arial" w:hAnsi="Arial" w:cs="Arial"/>
-          <w:sz w:val="20"/>
-          <w:szCs w:val="20"/>
-        </w:rPr>
-      </w:pPr>
-      <w:r>
-        <w:rPr>
-          <w:rFonts w:ascii="Arial" w:hAnsi="Arial" w:cs="Arial"/>
-          <w:sz w:val="20"/>
-          <w:szCs w:val="20"/>
-        </w:rPr>
-        <w:t xml:space="preserve">• </w:t>
-      </w:r>
-      <w:r>
-        <w:rPr>
-          <w:rFonts w:ascii="Arial" w:hAnsi="Arial" w:cs="Arial"/>
-          <w:sz w:val="20"/>
-          <w:szCs w:val="20"/>
-        </w:rPr>
-        <w:t>Conducted Factory Acceptance Testing (FAT) for main bearing system alongside client representatives, ensuring compliance with technical specifications and performance standards</w:t>
-      </w:r>
-      <w:r>
-        <w:rPr>
-          <w:rFonts w:ascii="Arial" w:hAnsi="Arial" w:cs="Arial"/>
-          <w:sz w:val="20"/>
-          <w:szCs w:val="20"/>
-        </w:rPr>
-        <w:t>.</w:t>
-      </w:r>
-    </w:p>
-    <w:p>
-      <w:pPr>
-        <w:pBdr>
-          <w:bottom w:val="single" w:sz="6" w:space="1" w:color="auto"/>
-        </w:pBdr>
-        <w:spacing w:line="240" w:lineRule="auto"/>
-        <w:jc w:val="both"/>
-        <w:rPr>
-          <w:rFonts w:ascii="Arial" w:hAnsi="Arial" w:cs="Arial"/>
           <w:sz w:val="6"/>
           <w:szCs w:val="6"/>
         </w:rPr>
@@ -1626,10 +1729,20 @@
       <w:r>
         <w:rPr>
           <w:rFonts w:ascii="Arial" w:hAnsi="Arial" w:cs="Arial"/>
-          <w:sz w:val="20"/>
-          <w:szCs w:val="20"/>
-        </w:rPr>
-        <w:t>Eliminated 100% of severe pipeline incidents by designing and implementing corrective solutions including support systems for unstable terrain, pipe handling methods, and provisional sections for operational continuity</w:t>
+          <w:b/>
+          <w:bCs/>
+          <w:sz w:val="20"/>
+          <w:szCs w:val="20"/>
+        </w:rPr>
+        <w:t>Eliminated 100% of severe pipeline</w:t>
+      </w:r>
+      <w:r>
+        <w:rPr>
+          <w:rFonts w:ascii="Arial" w:hAnsi="Arial" w:cs="Arial"/>
+          <w:sz w:val="20"/>
+          <w:szCs w:val="20"/>
+        </w:rPr>
+        <w:t xml:space="preserve"> incidents by designing and implementing corrective solutions including support systems for unstable terrain, pipe handling methods, and provisional sections for operational continuity</w:t>
       </w:r>
       <w:r>
         <w:rPr>
@@ -1730,10 +1843,38 @@
       <w:r>
         <w:rPr>
           <w:rFonts w:ascii="Arial" w:hAnsi="Arial" w:cs="Arial"/>
-          <w:sz w:val="20"/>
-          <w:szCs w:val="20"/>
-        </w:rPr>
-        <w:t>Verified existing pipeline systems through inspections, pressure testing, and assembly analysis across tunnel operations</w:t>
+          <w:b/>
+          <w:bCs/>
+          <w:sz w:val="20"/>
+          <w:szCs w:val="20"/>
+        </w:rPr>
+        <w:t>Resolved critical failures</w:t>
+      </w:r>
+      <w:r>
+        <w:rPr>
+          <w:rFonts w:ascii="Arial" w:hAnsi="Arial" w:cs="Arial"/>
+          <w:sz w:val="20"/>
+          <w:szCs w:val="20"/>
+        </w:rPr>
+        <w:t xml:space="preserve"> in high-pressure fluid systems (slurry/mortar) by designing isometric drawings and P&amp;IDs, complying with </w:t>
+      </w:r>
+      <w:r>
+        <w:rPr>
+          <w:rFonts w:ascii="Arial" w:hAnsi="Arial" w:cs="Arial"/>
+          <w:b/>
+          <w:bCs/>
+          <w:sz w:val="20"/>
+          <w:szCs w:val="20"/>
+        </w:rPr>
+        <w:t>ASME B31</w:t>
+      </w:r>
+      <w:r>
+        <w:rPr>
+          <w:rFonts w:ascii="Arial" w:hAnsi="Arial" w:cs="Arial"/>
+          <w:sz w:val="20"/>
+          <w:szCs w:val="20"/>
+        </w:rPr>
+        <w:t xml:space="preserve"> international standards.</w:t>
       </w:r>
     </w:p>
     <w:p>
@@ -1741,47 +1882,12 @@
         <w:pBdr>
           <w:bottom w:val="single" w:sz="6" w:space="1" w:color="auto"/>
         </w:pBdr>
-        <w:jc w:val="both"/>
-        <w:rPr>
-          <w:rFonts w:ascii="Arial" w:hAnsi="Arial" w:cs="Arial"/>
-          <w:sz w:val="20"/>
-          <w:szCs w:val="20"/>
-        </w:rPr>
-      </w:pPr>
-      <w:r>
-        <w:rPr>
-          <w:rFonts w:ascii="Arial" w:hAnsi="Arial" w:cs="Arial"/>
-          <w:sz w:val="20"/>
-          <w:szCs w:val="20"/>
-        </w:rPr>
-        <w:t xml:space="preserve">• </w:t>
-      </w:r>
-      <w:r>
-        <w:rPr>
-          <w:rFonts w:ascii="Arial" w:hAnsi="Arial" w:cs="Arial"/>
-          <w:sz w:val="20"/>
-          <w:szCs w:val="20"/>
-        </w:rPr>
-        <w:t xml:space="preserve">Resolved critical system failures threatening project deadlines, </w:t>
-      </w:r>
-      <w:r>
-        <w:rPr>
-          <w:rFonts w:ascii="Arial" w:hAnsi="Arial" w:cs="Arial"/>
-          <w:b/>
-          <w:bCs/>
-          <w:sz w:val="20"/>
-          <w:szCs w:val="20"/>
-        </w:rPr>
-        <w:t>preventing potential penalties of over $250,000</w:t>
-      </w:r>
-      <w:r>
-        <w:rPr>
-          <w:rFonts w:ascii="Arial" w:hAnsi="Arial" w:cs="Arial"/>
-          <w:sz w:val="20"/>
-          <w:szCs w:val="20"/>
-        </w:rPr>
-        <w:t xml:space="preserve"> and restoring client confidence.</w:t>
-      </w:r>
+        <w:rPr>
+          <w:rFonts w:ascii="Arial" w:hAnsi="Arial" w:cs="Arial"/>
+          <w:sz w:val="2"/>
+          <w:szCs w:val="2"/>
+        </w:rPr>
+      </w:pPr>
     </w:p>
     <w:p>
       <w:pPr>
@@ -1790,6 +1896,168 @@
         </w:pBdr>
         <w:rPr>
           <w:rFonts w:ascii="Arial" w:hAnsi="Arial" w:cs="Arial"/>
+          <w:b/>
+          <w:bCs/>
+        </w:rPr>
+      </w:pPr>
+      <w:r>
+        <w:rPr>
+          <w:rFonts w:ascii="Arial" w:hAnsi="Arial" w:cs="Arial"/>
+          <w:b/>
+          <w:bCs/>
+        </w:rPr>
+        <w:t>TRAINING</w:t>
+      </w:r>
+      <w:r>
+        <w:rPr>
+          <w:rFonts w:ascii="Arial" w:hAnsi="Arial" w:cs="Arial"/>
+          <w:b/>
+          <w:bCs/>
+        </w:rPr>
+        <w:t xml:space="preserve"> &amp; COURSES</w:t>
+      </w:r>
+    </w:p>
+    <w:p>
+      <w:pPr>
+        <w:spacing w:after="0" w:line="360" w:lineRule="auto"/>
+        <w:jc w:val="both"/>
+        <w:rPr>
+          <w:rFonts w:ascii="Arial" w:eastAsia="Arial" w:hAnsi="Arial"/>
+          <w:sz w:val="20"/>
+          <w:szCs w:val="20"/>
+        </w:rPr>
+      </w:pPr>
+      <w:r>
+        <w:rPr>
+          <w:rFonts w:ascii="Arial" w:eastAsia="Arial" w:hAnsi="Arial" w:cs="Arial"/>
+          <w:sz w:val="20"/>
+          <w:szCs w:val="20"/>
+        </w:rPr>
+        <w:t>•</w:t>
+      </w:r>
+      <w:r>
+        <w:rPr>
+          <w:rFonts w:ascii="Arial" w:eastAsia="Arial" w:hAnsi="Arial"/>
+          <w:sz w:val="20"/>
+          <w:szCs w:val="20"/>
+        </w:rPr>
+        <w:t xml:space="preserve"> </w:t>
+      </w:r>
+      <w:r>
+        <w:rPr>
+          <w:rFonts w:ascii="Arial" w:eastAsia="Arial" w:hAnsi="Arial"/>
+          <w:b/>
+          <w:bCs/>
+          <w:sz w:val="20"/>
+          <w:szCs w:val="20"/>
+        </w:rPr>
+        <w:t>Design of Thermofluidic System</w:t>
+      </w:r>
+      <w:r>
+        <w:rPr>
+          <w:rFonts w:ascii="Arial" w:eastAsia="Arial" w:hAnsi="Arial"/>
+          <w:sz w:val="20"/>
+          <w:szCs w:val="20"/>
+        </w:rPr>
+        <w:t xml:space="preserve"> - </w:t>
+      </w:r>
+      <w:r>
+        <w:rPr>
+          <w:rFonts w:ascii="Arial" w:hAnsi="Arial" w:cs="Arial"/>
+          <w:i/>
+          <w:iCs/>
+          <w:sz w:val="20"/>
+          <w:szCs w:val="20"/>
+        </w:rPr>
+        <w:t xml:space="preserve">Technology University of Panama (Aug 2023) </w:t>
+      </w:r>
+    </w:p>
+    <w:p>
+      <w:pPr>
+        <w:spacing w:after="0" w:line="360" w:lineRule="auto"/>
+        <w:jc w:val="both"/>
+        <w:rPr>
+          <w:rFonts w:ascii="Arial" w:eastAsia="Arial" w:hAnsi="Arial"/>
+          <w:i/>
+          <w:iCs/>
+          <w:sz w:val="20"/>
+          <w:szCs w:val="20"/>
+        </w:rPr>
+      </w:pPr>
+      <w:r>
+        <w:rPr>
+          <w:rFonts w:ascii="Arial" w:eastAsia="Arial" w:hAnsi="Arial" w:cs="Arial"/>
+          <w:sz w:val="20"/>
+          <w:szCs w:val="20"/>
+        </w:rPr>
+        <w:t>•</w:t>
+      </w:r>
+      <w:r>
+        <w:rPr>
+          <w:rFonts w:ascii="Arial" w:eastAsia="Arial" w:hAnsi="Arial"/>
+          <w:sz w:val="20"/>
+          <w:szCs w:val="20"/>
+        </w:rPr>
+        <w:t xml:space="preserve"> </w:t>
+      </w:r>
+      <w:r>
+        <w:rPr>
+          <w:rFonts w:ascii="Arial" w:eastAsia="Arial" w:hAnsi="Arial"/>
+          <w:b/>
+          <w:bCs/>
+          <w:sz w:val="20"/>
+          <w:szCs w:val="20"/>
+        </w:rPr>
+        <w:t>Fluid Technology, Hydraulic and</w:t>
+      </w:r>
+      <w:r>
+        <w:rPr>
+          <w:rFonts w:ascii="Arial" w:eastAsia="Arial" w:hAnsi="Arial"/>
+          <w:b/>
+          <w:bCs/>
+          <w:sz w:val="20"/>
+          <w:szCs w:val="20"/>
+        </w:rPr>
+        <w:t xml:space="preserve"> Lubrication</w:t>
+      </w:r>
+      <w:r>
+        <w:rPr>
+          <w:rFonts w:ascii="Arial" w:eastAsia="Arial" w:hAnsi="Arial"/>
+          <w:sz w:val="20"/>
+          <w:szCs w:val="20"/>
+        </w:rPr>
+        <w:t xml:space="preserve"> - </w:t>
+      </w:r>
+      <w:r>
+        <w:rPr>
+          <w:rFonts w:ascii="Arial" w:eastAsia="Arial" w:hAnsi="Arial"/>
+          <w:i/>
+          <w:iCs/>
+          <w:sz w:val="20"/>
+          <w:szCs w:val="20"/>
+        </w:rPr>
+        <w:t>HERRENKNECHT AG (Jun 2025)</w:t>
+      </w:r>
+    </w:p>
+    <w:p>
+      <w:pPr>
+        <w:spacing w:after="0" w:line="360" w:lineRule="auto"/>
+        <w:rPr>
+          <w:rFonts w:ascii="Arial" w:eastAsia="Arial" w:hAnsi="Arial"/>
+          <w:b/>
+          <w:bCs/>
+          <w:sz w:val="10"/>
+          <w:szCs w:val="10"/>
+        </w:rPr>
+      </w:pPr>
+    </w:p>
+    <w:p>
+      <w:pPr>
+        <w:spacing w:after="0" w:line="360" w:lineRule="auto"/>
+        <w:rPr>
+          <w:rFonts w:ascii="Arial" w:eastAsia="Arial" w:hAnsi="Arial"/>
+          <w:b/>
+          <w:bCs/>
           <w:sz w:val="2"/>
           <w:szCs w:val="2"/>
         </w:rPr>
@@ -1812,42 +2080,59 @@
           <w:b/>
           <w:bCs/>
         </w:rPr>
-        <w:t>TRAINING</w:t>
-      </w:r>
-      <w:r>
-        <w:rPr>
-          <w:rFonts w:ascii="Arial" w:hAnsi="Arial" w:cs="Arial"/>
-          <w:b/>
-          <w:bCs/>
-        </w:rPr>
-        <w:t xml:space="preserve"> &amp; COURSES</w:t>
+        <w:t>ADDITIONAL</w:t>
       </w:r>
     </w:p>
     <w:p>
       <w:pPr>
         <w:spacing w:after="0" w:line="360" w:lineRule="auto"/>
-        <w:jc w:val="both"/>
-        <w:rPr>
-          <w:rFonts w:ascii="Arial" w:eastAsia="Arial" w:hAnsi="Arial"/>
-          <w:i/>
-          <w:iCs/>
-          <w:sz w:val="20"/>
-          <w:szCs w:val="20"/>
-        </w:rPr>
-      </w:pPr>
-      <w:r>
-        <w:rPr>
-          <w:rFonts w:ascii="Arial" w:eastAsia="Arial" w:hAnsi="Arial" w:cs="Arial"/>
-          <w:sz w:val="20"/>
-          <w:szCs w:val="20"/>
-        </w:rPr>
-        <w:t>•</w:t>
-      </w:r>
-      <w:r>
-        <w:rPr>
-          <w:rFonts w:ascii="Arial" w:eastAsia="Arial" w:hAnsi="Arial"/>
-          <w:sz w:val="20"/>
-          <w:szCs w:val="20"/>
+        <w:rPr>
+          <w:rFonts w:ascii="Arial" w:eastAsia="Arial" w:hAnsi="Arial"/>
+          <w:b/>
+          <w:bCs/>
+          <w:sz w:val="20"/>
+          <w:szCs w:val="24"/>
+        </w:rPr>
+      </w:pPr>
+      <w:r>
+        <w:rPr>
+          <w:rFonts w:ascii="Arial" w:eastAsia="Arial" w:hAnsi="Arial"/>
+          <w:b/>
+          <w:bCs/>
+          <w:sz w:val="20"/>
+          <w:szCs w:val="24"/>
+        </w:rPr>
+        <w:t xml:space="preserve">Technical Skills: </w:t>
+      </w:r>
+      <w:r>
+        <w:rPr>
+          <w:rFonts w:ascii="Arial" w:eastAsia="Arial" w:hAnsi="Arial"/>
+          <w:sz w:val="20"/>
+          <w:szCs w:val="24"/>
+        </w:rPr>
+        <w:t>Advance in CAD (SolidWorks, AutoCAD, Inventor), ANSYS, Microsoft Offic</w:t>
+      </w:r>
+      <w:r>
+        <w:rPr>
+          <w:rFonts w:ascii="Arial" w:eastAsia="Arial" w:hAnsi="Arial"/>
+          <w:sz w:val="20"/>
+          <w:szCs w:val="24"/>
+        </w:rPr>
+        <w:t xml:space="preserve">e, </w:t>
+      </w:r>
+      <w:r>
+        <w:rPr>
+          <w:rFonts w:ascii="Arial" w:eastAsia="Arial" w:hAnsi="Arial"/>
+          <w:sz w:val="20"/>
+          <w:szCs w:val="24"/>
+        </w:rPr>
+        <w:t>SAP Business Suite</w:t>
+      </w:r>
+      <w:r>
+        <w:rPr>
+          <w:rFonts w:ascii="Arial" w:eastAsia="Arial" w:hAnsi="Arial"/>
+          <w:sz w:val="20"/>
+          <w:szCs w:val="24"/>
         </w:rPr>
         <w:t xml:space="preserve"> </w:t>
       </w:r>
@@ -1857,237 +2142,151 @@
           <w:b/>
           <w:bCs/>
           <w:sz w:val="20"/>
-          <w:szCs w:val="20"/>
-        </w:rPr>
-        <w:t>Design of Industrial Piping Systems Specialization</w:t>
-      </w:r>
-      <w:r>
-        <w:rPr>
-          <w:rFonts w:ascii="Arial" w:eastAsia="Arial" w:hAnsi="Arial"/>
-          <w:sz w:val="20"/>
-          <w:szCs w:val="20"/>
-        </w:rPr>
-        <w:t xml:space="preserve"> – </w:t>
-      </w:r>
-      <w:r>
-        <w:rPr>
-          <w:rFonts w:ascii="Arial" w:eastAsia="Arial" w:hAnsi="Arial"/>
-          <w:i/>
-          <w:iCs/>
-          <w:sz w:val="20"/>
-          <w:szCs w:val="20"/>
-        </w:rPr>
-        <w:t xml:space="preserve">Larsen &amp; Toubro </w:t>
-      </w:r>
-      <w:proofErr w:type="spellStart"/>
-      <w:r>
-        <w:rPr>
-          <w:rFonts w:ascii="Arial" w:eastAsia="Arial" w:hAnsi="Arial"/>
-          <w:i/>
-          <w:iCs/>
-          <w:sz w:val="20"/>
-          <w:szCs w:val="20"/>
-        </w:rPr>
-        <w:t>EduTech</w:t>
-      </w:r>
-      <w:proofErr w:type="spellEnd"/>
-      <w:r>
-        <w:rPr>
-          <w:rFonts w:ascii="Arial" w:eastAsia="Arial" w:hAnsi="Arial"/>
-          <w:i/>
-          <w:iCs/>
-          <w:sz w:val="20"/>
-          <w:szCs w:val="20"/>
-        </w:rPr>
-        <w:t>, Expected (Nov 2025)</w:t>
+          <w:szCs w:val="24"/>
+        </w:rPr>
+        <w:t xml:space="preserve"> </w:t>
       </w:r>
     </w:p>
     <w:p>
       <w:pPr>
         <w:spacing w:after="0" w:line="360" w:lineRule="auto"/>
-        <w:jc w:val="both"/>
-        <w:rPr>
-          <w:rFonts w:ascii="Arial" w:eastAsia="Arial" w:hAnsi="Arial"/>
-          <w:sz w:val="20"/>
-          <w:szCs w:val="20"/>
-        </w:rPr>
-      </w:pPr>
-      <w:r>
-        <w:rPr>
-          <w:rFonts w:ascii="Arial" w:eastAsia="Arial" w:hAnsi="Arial" w:cs="Arial"/>
-          <w:sz w:val="20"/>
-          <w:szCs w:val="20"/>
-        </w:rPr>
-        <w:t>•</w:t>
-      </w:r>
-      <w:r>
-        <w:rPr>
-          <w:rFonts w:ascii="Arial" w:eastAsia="Arial" w:hAnsi="Arial"/>
-          <w:sz w:val="20"/>
-          <w:szCs w:val="20"/>
+        <w:rPr>
+          <w:rFonts w:ascii="Arial" w:eastAsia="Arial" w:hAnsi="Arial"/>
+          <w:b/>
+          <w:bCs/>
+          <w:sz w:val="20"/>
+          <w:szCs w:val="24"/>
+        </w:rPr>
+      </w:pPr>
+      <w:r>
+        <w:rPr>
+          <w:rFonts w:ascii="Arial" w:eastAsia="Arial" w:hAnsi="Arial"/>
+          <w:b/>
+          <w:bCs/>
+          <w:sz w:val="20"/>
+          <w:szCs w:val="24"/>
+        </w:rPr>
+        <w:t xml:space="preserve">Languages: </w:t>
+      </w:r>
+      <w:r>
+        <w:rPr>
+          <w:rFonts w:ascii="Arial" w:eastAsia="Arial" w:hAnsi="Arial"/>
+          <w:sz w:val="20"/>
+          <w:szCs w:val="24"/>
+        </w:rPr>
+        <w:t xml:space="preserve">Spanish (Native); English </w:t>
+      </w:r>
+      <w:r>
+        <w:rPr>
+          <w:rFonts w:ascii="Arial" w:eastAsia="Arial" w:hAnsi="Arial"/>
+          <w:sz w:val="20"/>
+          <w:szCs w:val="24"/>
+        </w:rPr>
+        <w:t>(</w:t>
+      </w:r>
+      <w:r>
+        <w:rPr>
+          <w:rFonts w:ascii="Arial" w:eastAsia="Arial" w:hAnsi="Arial"/>
+          <w:sz w:val="20"/>
+          <w:szCs w:val="24"/>
+        </w:rPr>
+        <w:t>C1</w:t>
+      </w:r>
+      <w:r>
+        <w:rPr>
+          <w:rFonts w:ascii="Arial" w:eastAsia="Arial" w:hAnsi="Arial"/>
+          <w:sz w:val="20"/>
+          <w:szCs w:val="24"/>
+        </w:rPr>
+        <w:t xml:space="preserve"> - </w:t>
+      </w:r>
+      <w:r>
+        <w:rPr>
+          <w:rFonts w:ascii="Arial" w:eastAsia="Arial" w:hAnsi="Arial"/>
+          <w:sz w:val="20"/>
+          <w:szCs w:val="24"/>
+        </w:rPr>
+        <w:t>Full professional proficiency); German (</w:t>
+      </w:r>
+      <w:r>
+        <w:rPr>
+          <w:rFonts w:ascii="Arial" w:eastAsia="Arial" w:hAnsi="Arial"/>
+          <w:sz w:val="20"/>
+          <w:szCs w:val="24"/>
+        </w:rPr>
+        <w:t xml:space="preserve">A2 - </w:t>
+      </w:r>
+      <w:r>
+        <w:rPr>
+          <w:rFonts w:ascii="Arial" w:eastAsia="Arial" w:hAnsi="Arial"/>
+          <w:sz w:val="20"/>
+          <w:szCs w:val="24"/>
+        </w:rPr>
+        <w:t>Elementary Proficiency)</w:t>
+      </w:r>
+      <w:r>
+        <w:rPr>
+          <w:rFonts w:ascii="Arial" w:eastAsia="Arial" w:hAnsi="Arial"/>
+          <w:b/>
+          <w:bCs/>
+          <w:sz w:val="20"/>
+          <w:szCs w:val="24"/>
         </w:rPr>
         <w:t xml:space="preserve"> </w:t>
-      </w:r>
-      <w:r>
-        <w:rPr>
-          <w:rFonts w:ascii="Arial" w:eastAsia="Arial" w:hAnsi="Arial"/>
-          <w:b/>
-          <w:bCs/>
-          <w:sz w:val="20"/>
-          <w:szCs w:val="20"/>
-        </w:rPr>
-        <w:t>Design of Thermofluidic System</w:t>
-      </w:r>
-      <w:r>
-        <w:rPr>
-          <w:rFonts w:ascii="Arial" w:eastAsia="Arial" w:hAnsi="Arial"/>
-          <w:sz w:val="20"/>
-          <w:szCs w:val="20"/>
-        </w:rPr>
-        <w:t xml:space="preserve"> - </w:t>
-      </w:r>
-      <w:r>
-        <w:rPr>
-          <w:rFonts w:ascii="Arial" w:hAnsi="Arial" w:cs="Arial"/>
-          <w:i/>
-          <w:iCs/>
-          <w:sz w:val="20"/>
-          <w:szCs w:val="20"/>
-        </w:rPr>
-        <w:t xml:space="preserve">Technology University of Panama (Aug 2023) </w:t>
       </w:r>
     </w:p>
     <w:p>
       <w:pPr>
         <w:spacing w:after="0" w:line="360" w:lineRule="auto"/>
-        <w:jc w:val="both"/>
-        <w:rPr>
-          <w:rFonts w:ascii="Arial" w:eastAsia="Arial" w:hAnsi="Arial"/>
-          <w:i/>
-          <w:iCs/>
-          <w:sz w:val="20"/>
-          <w:szCs w:val="20"/>
-        </w:rPr>
-      </w:pPr>
-      <w:r>
-        <w:rPr>
-          <w:rFonts w:ascii="Arial" w:eastAsia="Arial" w:hAnsi="Arial" w:cs="Arial"/>
-          <w:sz w:val="20"/>
-          <w:szCs w:val="20"/>
-        </w:rPr>
-        <w:t>•</w:t>
-      </w:r>
-      <w:r>
-        <w:rPr>
-          <w:rFonts w:ascii="Arial" w:eastAsia="Arial" w:hAnsi="Arial"/>
-          <w:sz w:val="20"/>
-          <w:szCs w:val="20"/>
+        <w:rPr>
+          <w:rFonts w:ascii="Arial" w:eastAsia="Arial" w:hAnsi="Arial"/>
+          <w:b/>
+          <w:bCs/>
+          <w:sz w:val="20"/>
+          <w:szCs w:val="24"/>
+        </w:rPr>
+      </w:pPr>
+      <w:r>
+        <w:rPr>
+          <w:rFonts w:ascii="Arial" w:eastAsia="Arial" w:hAnsi="Arial"/>
+          <w:b/>
+          <w:bCs/>
+          <w:sz w:val="20"/>
+          <w:szCs w:val="24"/>
+        </w:rPr>
+        <w:t xml:space="preserve">Awards: </w:t>
+      </w:r>
+      <w:r>
+        <w:rPr>
+          <w:rFonts w:ascii="Arial" w:eastAsia="Arial" w:hAnsi="Arial"/>
+          <w:sz w:val="20"/>
+          <w:szCs w:val="24"/>
+        </w:rPr>
+        <w:t>Finalist – National Scientific Initiation Conference</w:t>
+      </w:r>
+      <w:r>
+        <w:rPr>
+          <w:rFonts w:ascii="Arial" w:eastAsia="Arial" w:hAnsi="Arial"/>
+          <w:sz w:val="20"/>
+          <w:szCs w:val="24"/>
         </w:rPr>
         <w:t xml:space="preserve"> </w:t>
       </w:r>
       <w:r>
         <w:rPr>
           <w:rFonts w:ascii="Arial" w:eastAsia="Arial" w:hAnsi="Arial"/>
-          <w:b/>
-          <w:bCs/>
-          <w:sz w:val="20"/>
-          <w:szCs w:val="20"/>
-        </w:rPr>
-        <w:t>Fluid Technology, Hydraulic and</w:t>
-      </w:r>
-      <w:r>
-        <w:rPr>
-          <w:rFonts w:ascii="Arial" w:eastAsia="Arial" w:hAnsi="Arial"/>
-          <w:b/>
-          <w:bCs/>
-          <w:sz w:val="20"/>
-          <w:szCs w:val="20"/>
-        </w:rPr>
-        <w:t xml:space="preserve"> Lubrication</w:t>
-      </w:r>
-      <w:r>
-        <w:rPr>
-          <w:rFonts w:ascii="Arial" w:eastAsia="Arial" w:hAnsi="Arial"/>
-          <w:sz w:val="20"/>
-          <w:szCs w:val="20"/>
-        </w:rPr>
-        <w:t xml:space="preserve"> - </w:t>
-      </w:r>
-      <w:r>
-        <w:rPr>
-          <w:rFonts w:ascii="Arial" w:eastAsia="Arial" w:hAnsi="Arial"/>
-          <w:i/>
-          <w:iCs/>
-          <w:sz w:val="20"/>
-          <w:szCs w:val="20"/>
-        </w:rPr>
-        <w:t>HERRENKNECHT AG (Jun 2025)</w:t>
-      </w:r>
-    </w:p>
-    <w:p>
-      <w:pPr>
-        <w:spacing w:after="0" w:line="360" w:lineRule="auto"/>
-        <w:rPr>
-          <w:rFonts w:ascii="Arial" w:eastAsia="Arial" w:hAnsi="Arial"/>
-          <w:b/>
-          <w:bCs/>
-          <w:sz w:val="10"/>
-          <w:szCs w:val="10"/>
-        </w:rPr>
-      </w:pPr>
-    </w:p>
-    <w:p>
-      <w:pPr>
-        <w:spacing w:after="0" w:line="360" w:lineRule="auto"/>
-        <w:rPr>
-          <w:rFonts w:ascii="Arial" w:eastAsia="Arial" w:hAnsi="Arial"/>
-          <w:b/>
-          <w:bCs/>
-          <w:sz w:val="2"/>
-          <w:szCs w:val="2"/>
-        </w:rPr>
-      </w:pPr>
-    </w:p>
-    <w:p>
-      <w:pPr>
-        <w:pBdr>
-          <w:bottom w:val="single" w:sz="6" w:space="1" w:color="auto"/>
-        </w:pBdr>
-        <w:rPr>
-          <w:rFonts w:ascii="Arial" w:hAnsi="Arial" w:cs="Arial"/>
-          <w:b/>
-          <w:bCs/>
-        </w:rPr>
-      </w:pPr>
-      <w:r>
-        <w:rPr>
-          <w:rFonts w:ascii="Arial" w:hAnsi="Arial" w:cs="Arial"/>
-          <w:b/>
-          <w:bCs/>
-        </w:rPr>
-        <w:t>ADDITIONAL</w:t>
-      </w:r>
-    </w:p>
-    <w:p>
-      <w:pPr>
-        <w:spacing w:after="0" w:line="360" w:lineRule="auto"/>
-        <w:rPr>
-          <w:rFonts w:ascii="Arial" w:eastAsia="Arial" w:hAnsi="Arial"/>
-          <w:b/>
-          <w:bCs/>
           <w:sz w:val="20"/>
           <w:szCs w:val="24"/>
         </w:rPr>
-      </w:pPr>
-      <w:r>
-        <w:rPr>
-          <w:rFonts w:ascii="Arial" w:eastAsia="Arial" w:hAnsi="Arial"/>
-          <w:b/>
-          <w:bCs/>
+        <w:t>(2023) / Resonant Wind Turbine</w:t>
+      </w:r>
+      <w:r>
+        <w:rPr>
+          <w:rFonts w:ascii="Arial" w:eastAsia="Arial" w:hAnsi="Arial"/>
           <w:sz w:val="20"/>
           <w:szCs w:val="24"/>
         </w:rPr>
-        <w:t xml:space="preserve">Technical Skills: </w:t>
+        <w:t xml:space="preserve"> Mathematical </w:t>
       </w:r>
       <w:r>
         <w:rPr>
@@ -2095,189 +2294,7 @@
           <w:sz w:val="20"/>
           <w:szCs w:val="24"/>
         </w:rPr>
-        <w:t>Advance in CAD (SolidWorks, AutoCAD, Inventor), ANSYS, Microsoft Offic</w:t>
-      </w:r>
-      <w:r>
-        <w:rPr>
-          <w:rFonts w:ascii="Arial" w:eastAsia="Arial" w:hAnsi="Arial"/>
-          <w:sz w:val="20"/>
-          <w:szCs w:val="24"/>
-        </w:rPr>
-        <w:t xml:space="preserve">e, </w:t>
-      </w:r>
-      <w:r>
-        <w:rPr>
-          <w:rFonts w:ascii="Arial" w:eastAsia="Arial" w:hAnsi="Arial"/>
-          <w:sz w:val="20"/>
-          <w:szCs w:val="24"/>
-        </w:rPr>
-        <w:t>SAP Business Suite</w:t>
-      </w:r>
-      <w:r>
-        <w:rPr>
-          <w:rFonts w:ascii="Arial" w:eastAsia="Arial" w:hAnsi="Arial"/>
-          <w:sz w:val="20"/>
-          <w:szCs w:val="24"/>
-        </w:rPr>
-        <w:t xml:space="preserve"> </w:t>
-      </w:r>
-      <w:r>
-        <w:rPr>
-          <w:rFonts w:ascii="Arial" w:eastAsia="Arial" w:hAnsi="Arial"/>
-          <w:b/>
-          <w:bCs/>
-          <w:sz w:val="20"/>
-          <w:szCs w:val="24"/>
-        </w:rPr>
-        <w:t xml:space="preserve"> </w:t>
-      </w:r>
-    </w:p>
-    <w:p>
-      <w:pPr>
-        <w:spacing w:after="0" w:line="360" w:lineRule="auto"/>
-        <w:rPr>
-          <w:rFonts w:ascii="Arial" w:eastAsia="Arial" w:hAnsi="Arial"/>
-          <w:b/>
-          <w:bCs/>
-          <w:sz w:val="20"/>
-          <w:szCs w:val="24"/>
-        </w:rPr>
-      </w:pPr>
-      <w:r>
-        <w:rPr>
-          <w:rFonts w:ascii="Arial" w:eastAsia="Arial" w:hAnsi="Arial"/>
-          <w:b/>
-          <w:bCs/>
-          <w:sz w:val="20"/>
-          <w:szCs w:val="24"/>
-        </w:rPr>
-        <w:t xml:space="preserve">Programming Skills: </w:t>
-      </w:r>
-      <w:r>
-        <w:rPr>
-          <w:rFonts w:ascii="Arial" w:eastAsia="Arial" w:hAnsi="Arial"/>
-          <w:sz w:val="20"/>
-          <w:szCs w:val="24"/>
-        </w:rPr>
-        <w:t>Proficient in Python, MATLAB, JavaScript</w:t>
-      </w:r>
-    </w:p>
-    <w:p>
-      <w:pPr>
-        <w:spacing w:after="0" w:line="360" w:lineRule="auto"/>
-        <w:rPr>
-          <w:rFonts w:ascii="Arial" w:eastAsia="Arial" w:hAnsi="Arial"/>
-          <w:b/>
-          <w:bCs/>
-          <w:sz w:val="20"/>
-          <w:szCs w:val="24"/>
-        </w:rPr>
-      </w:pPr>
-      <w:r>
-        <w:rPr>
-          <w:rFonts w:ascii="Arial" w:eastAsia="Arial" w:hAnsi="Arial"/>
-          <w:b/>
-          <w:bCs/>
-          <w:sz w:val="20"/>
-          <w:szCs w:val="24"/>
-        </w:rPr>
-        <w:t xml:space="preserve">Languages: </w:t>
-      </w:r>
-      <w:r>
-        <w:rPr>
-          <w:rFonts w:ascii="Arial" w:eastAsia="Arial" w:hAnsi="Arial"/>
-          <w:sz w:val="20"/>
-          <w:szCs w:val="24"/>
-        </w:rPr>
-        <w:t xml:space="preserve">Spanish (Native); English </w:t>
-      </w:r>
-      <w:r>
-        <w:rPr>
-          <w:rFonts w:ascii="Arial" w:eastAsia="Arial" w:hAnsi="Arial"/>
-          <w:sz w:val="20"/>
-          <w:szCs w:val="24"/>
-        </w:rPr>
-        <w:t>(</w:t>
-      </w:r>
-      <w:r>
-        <w:rPr>
-          <w:rFonts w:ascii="Arial" w:eastAsia="Arial" w:hAnsi="Arial"/>
-          <w:sz w:val="20"/>
-          <w:szCs w:val="24"/>
-        </w:rPr>
-        <w:t>C1</w:t>
-      </w:r>
-      <w:r>
-        <w:rPr>
-          <w:rFonts w:ascii="Arial" w:eastAsia="Arial" w:hAnsi="Arial"/>
-          <w:sz w:val="20"/>
-          <w:szCs w:val="24"/>
-        </w:rPr>
-        <w:t xml:space="preserve"> - </w:t>
-      </w:r>
-      <w:r>
-        <w:rPr>
-          <w:rFonts w:ascii="Arial" w:eastAsia="Arial" w:hAnsi="Arial"/>
-          <w:sz w:val="20"/>
-          <w:szCs w:val="24"/>
-        </w:rPr>
-        <w:t>Full professional proficiency); German (</w:t>
-      </w:r>
-      <w:r>
-        <w:rPr>
-          <w:rFonts w:ascii="Arial" w:eastAsia="Arial" w:hAnsi="Arial"/>
-          <w:sz w:val="20"/>
-          <w:szCs w:val="24"/>
-        </w:rPr>
-        <w:t xml:space="preserve">A2 - </w:t>
-      </w:r>
-      <w:r>
-        <w:rPr>
-          <w:rFonts w:ascii="Arial" w:eastAsia="Arial" w:hAnsi="Arial"/>
-          <w:sz w:val="20"/>
-          <w:szCs w:val="24"/>
-        </w:rPr>
-        <w:t>Elementary Proficiency)</w:t>
-      </w:r>
-      <w:r>
-        <w:rPr>
-          <w:rFonts w:ascii="Arial" w:eastAsia="Arial" w:hAnsi="Arial"/>
-          <w:b/>
-          <w:bCs/>
-          <w:sz w:val="20"/>
-          <w:szCs w:val="24"/>
-        </w:rPr>
-        <w:t xml:space="preserve"> </w:t>
-      </w:r>
-    </w:p>
-    <w:p>
-      <w:pPr>
-        <w:spacing w:after="0" w:line="360" w:lineRule="auto"/>
-        <w:rPr>
-          <w:rFonts w:ascii="Arial" w:eastAsia="Arial" w:hAnsi="Arial"/>
-          <w:b/>
-          <w:bCs/>
-          <w:sz w:val="20"/>
-          <w:szCs w:val="24"/>
-        </w:rPr>
-      </w:pPr>
-      <w:r>
-        <w:rPr>
-          <w:rFonts w:ascii="Arial" w:eastAsia="Arial" w:hAnsi="Arial"/>
-          <w:b/>
-          <w:bCs/>
-          <w:sz w:val="20"/>
-          <w:szCs w:val="24"/>
-        </w:rPr>
-        <w:t xml:space="preserve">Awards: </w:t>
-      </w:r>
-      <w:r>
-        <w:rPr>
-          <w:rFonts w:ascii="Arial" w:eastAsia="Arial" w:hAnsi="Arial"/>
-          <w:sz w:val="20"/>
-          <w:szCs w:val="24"/>
-        </w:rPr>
-        <w:t>Finalist – National Scientific Research Conference (Dynamic Vibration Project, 2023)</w:t>
+        <w:t>Model.</w:t>
       </w:r>
     </w:p>
     <w:sectPr>
@@ -3545,6 +3562,19 @@
       <w:u w:val="single"/>
     </w:rPr>
   </w:style>
+  <w:style w:type="paragraph" w:styleId="NormalWeb">
+    <w:name w:val="Normal (Web)"/>
+    <w:basedOn w:val="Normal"/>
+    <w:uiPriority w:val="99"/>
+    <w:semiHidden/>
+    <w:unhideWhenUsed/>
+    <w:rsid w:val="00C914AF"/>
+    <w:rPr>
+      <w:rFonts w:ascii="Times New Roman" w:hAnsi="Times New Roman" w:cs="Times New Roman"/>
+      <w:sz w:val="24"/>
+      <w:szCs w:val="24"/>
+    </w:rPr>
+  </w:style>
 </w:styles>
 </file>
 

</xml_diff>